<commit_message>
Progress on cleaning bulk RNAseq data
</commit_message>
<xml_diff>
--- a/hackday_agenda.docx
+++ b/hackday_agenda.docx
@@ -18,7 +18,27 @@
           <w:sz w:val="32"/>
           <w:szCs w:val="32"/>
         </w:rPr>
-        <w:t>SEATRAC TB Hackday 202</w:t>
+        <w:t xml:space="preserve">SEATRAC TB </w:t>
+      </w:r>
+      <w:proofErr w:type="spellStart"/>
+      <w:r>
+        <w:rPr>
+          <w:b/>
+          <w:bCs/>
+          <w:sz w:val="32"/>
+          <w:szCs w:val="32"/>
+        </w:rPr>
+        <w:t>Hackday</w:t>
+      </w:r>
+      <w:proofErr w:type="spellEnd"/>
+      <w:r>
+        <w:rPr>
+          <w:b/>
+          <w:bCs/>
+          <w:sz w:val="32"/>
+          <w:szCs w:val="32"/>
+        </w:rPr>
+        <w:t xml:space="preserve"> 202</w:t>
       </w:r>
       <w:r>
         <w:rPr>
@@ -196,12 +216,21 @@
         </w:rPr>
         <w:br/>
       </w:r>
-      <w:r>
-        <w:rPr>
-          <w:sz w:val="32"/>
-          <w:szCs w:val="32"/>
-        </w:rPr>
-        <w:t>O’Mack Symposium Suite</w:t>
+      <w:proofErr w:type="spellStart"/>
+      <w:r>
+        <w:rPr>
+          <w:sz w:val="32"/>
+          <w:szCs w:val="32"/>
+        </w:rPr>
+        <w:t>O’Mack</w:t>
+      </w:r>
+      <w:proofErr w:type="spellEnd"/>
+      <w:r>
+        <w:rPr>
+          <w:sz w:val="32"/>
+          <w:szCs w:val="32"/>
+        </w:rPr>
+        <w:t xml:space="preserve"> Symposium Suite</w:t>
       </w:r>
       <w:r>
         <w:rPr>
@@ -300,6 +329,7 @@
           <w:szCs w:val="32"/>
         </w:rPr>
       </w:pPr>
+      <w:proofErr w:type="spellStart"/>
       <w:r>
         <w:rPr>
           <w:sz w:val="32"/>
@@ -307,6 +337,7 @@
         </w:rPr>
         <w:t>Github</w:t>
       </w:r>
+      <w:proofErr w:type="spellEnd"/>
       <w:r>
         <w:rPr>
           <w:sz w:val="32"/>
@@ -315,15 +346,73 @@
         <w:t xml:space="preserve"> link: </w:t>
       </w:r>
       <w:hyperlink r:id="rId4" w:history="1">
+        <w:proofErr w:type="spellStart"/>
         <w:r>
           <w:rPr>
             <w:rStyle w:val="Hyperlink"/>
             <w:sz w:val="32"/>
             <w:szCs w:val="32"/>
           </w:rPr>
-          <w:t>FredHutch/seatrac-hackday-2024</w:t>
+          <w:t>FredHutch</w:t>
+        </w:r>
+        <w:proofErr w:type="spellEnd"/>
+        <w:r>
+          <w:rPr>
+            <w:rStyle w:val="Hyperlink"/>
+            <w:sz w:val="32"/>
+            <w:szCs w:val="32"/>
+          </w:rPr>
+          <w:t>/seatrac-hackday-2024</w:t>
         </w:r>
       </w:hyperlink>
+    </w:p>
+    <w:p>
+      <w:pPr>
+        <w:rPr>
+          <w:sz w:val="32"/>
+          <w:szCs w:val="32"/>
+        </w:rPr>
+      </w:pPr>
+    </w:p>
+    <w:p>
+      <w:pPr>
+        <w:rPr>
+          <w:sz w:val="32"/>
+          <w:szCs w:val="32"/>
+        </w:rPr>
+      </w:pPr>
+    </w:p>
+    <w:p>
+      <w:pPr>
+        <w:rPr>
+          <w:sz w:val="32"/>
+          <w:szCs w:val="32"/>
+        </w:rPr>
+      </w:pPr>
+    </w:p>
+    <w:p>
+      <w:pPr>
+        <w:rPr>
+          <w:sz w:val="32"/>
+          <w:szCs w:val="32"/>
+        </w:rPr>
+      </w:pPr>
+    </w:p>
+    <w:p>
+      <w:pPr>
+        <w:rPr>
+          <w:sz w:val="32"/>
+          <w:szCs w:val="32"/>
+        </w:rPr>
+      </w:pPr>
+    </w:p>
+    <w:p>
+      <w:pPr>
+        <w:rPr>
+          <w:sz w:val="32"/>
+          <w:szCs w:val="32"/>
+        </w:rPr>
+      </w:pPr>
     </w:p>
     <w:p>
       <w:pPr>
@@ -621,7 +710,6 @@
                 <w:sz w:val="28"/>
                 <w:szCs w:val="28"/>
               </w:rPr>
-              <w:lastRenderedPageBreak/>
               <w:t>10:00</w:t>
             </w:r>
           </w:p>

</xml_diff>